<commit_message>
Update The Cithara Sanctorum (Theologos) first complete draft.docx
</commit_message>
<xml_diff>
--- a/Drafts/The Cithara Sanctorum (Theologos) first complete draft.docx
+++ b/Drafts/The Cithara Sanctorum (Theologos) first complete draft.docx
@@ -101,87 +101,41 @@
       <w:pPr>
         <w:rPr>
           <w:rFonts w:ascii="Times New Roman" w:hAnsi="Times New Roman" w:cs="Times New Roman"/>
-        </w:rPr>
-      </w:pPr>
-      <w:r>
-        <w:rPr>
-          <w:rFonts w:ascii="Times New Roman" w:hAnsi="Times New Roman" w:cs="Times New Roman"/>
           <w:b/>
           <w:bCs/>
         </w:rPr>
-        <w:t>Draft v0.1</w:t>
-      </w:r>
-      <w:r>
-        <w:rPr>
-          <w:rFonts w:ascii="Times New Roman" w:hAnsi="Times New Roman" w:cs="Times New Roman"/>
-        </w:rPr>
-        <w:t> — Full draft, §§1 – 7 </w:t>
-      </w:r>
-      <w:r>
-        <w:rPr>
-          <w:rFonts w:ascii="Times New Roman" w:hAnsi="Times New Roman" w:cs="Times New Roman"/>
-          <w:b/>
-          <w:bCs/>
-        </w:rPr>
-        <w:t>Author:</w:t>
-      </w:r>
-      <w:r>
-        <w:rPr>
-          <w:rFonts w:ascii="Times New Roman" w:hAnsi="Times New Roman" w:cs="Times New Roman"/>
-        </w:rPr>
-        <w:t> Michal Valčo </w:t>
-      </w:r>
-      <w:r>
-        <w:rPr>
-          <w:rFonts w:ascii="Times New Roman" w:hAnsi="Times New Roman" w:cs="Times New Roman"/>
-          <w:b/>
-          <w:bCs/>
-        </w:rPr>
-        <w:t>Target:</w:t>
-      </w:r>
-      <w:r>
-        <w:rPr>
-          <w:rFonts w:ascii="Times New Roman" w:hAnsi="Times New Roman" w:cs="Times New Roman"/>
-        </w:rPr>
-        <w:t> </w:t>
-      </w:r>
-      <w:proofErr w:type="spellStart"/>
-      <w:r>
-        <w:rPr>
-          <w:rFonts w:ascii="Times New Roman" w:hAnsi="Times New Roman" w:cs="Times New Roman"/>
-          <w:i/>
-          <w:iCs/>
-        </w:rPr>
-        <w:t>Theologos</w:t>
-      </w:r>
-      <w:proofErr w:type="spellEnd"/>
-      <w:r>
-        <w:rPr>
-          <w:rFonts w:ascii="Times New Roman" w:hAnsi="Times New Roman" w:cs="Times New Roman"/>
-          <w:i/>
-          <w:iCs/>
-        </w:rPr>
-        <w:t>: Theological Revue</w:t>
-      </w:r>
-      <w:r>
-        <w:rPr>
-          <w:rFonts w:ascii="Times New Roman" w:hAnsi="Times New Roman" w:cs="Times New Roman"/>
-        </w:rPr>
-        <w:t> </w:t>
-      </w:r>
-      <w:r>
-        <w:rPr>
-          <w:rFonts w:ascii="Times New Roman" w:hAnsi="Times New Roman" w:cs="Times New Roman"/>
-          <w:b/>
-          <w:bCs/>
-        </w:rPr>
-        <w:t>Funder:</w:t>
-      </w:r>
-      <w:r>
-        <w:rPr>
-          <w:rFonts w:ascii="Times New Roman" w:hAnsi="Times New Roman" w:cs="Times New Roman"/>
-        </w:rPr>
-        <w:t> APVV-24-0484 (TEPALIT)</w:t>
+      </w:pPr>
+      <w:r>
+        <w:rPr>
+          <w:rFonts w:ascii="Times New Roman" w:hAnsi="Times New Roman" w:cs="Times New Roman"/>
+        </w:rPr>
+        <w:t xml:space="preserve">Michal </w:t>
+      </w:r>
+      <w:proofErr w:type="gramStart"/>
+      <w:r>
+        <w:rPr>
+          <w:rFonts w:ascii="Times New Roman" w:hAnsi="Times New Roman" w:cs="Times New Roman"/>
+        </w:rPr>
+        <w:t>Valčo </w:t>
+      </w:r>
+      <w:r>
+        <w:rPr>
+          <w:rFonts w:ascii="Times New Roman" w:hAnsi="Times New Roman" w:cs="Times New Roman"/>
+        </w:rPr>
+        <w:t xml:space="preserve"> </w:t>
+      </w:r>
+      <w:r>
+        <w:rPr>
+          <w:rFonts w:ascii="Times New Roman" w:hAnsi="Times New Roman" w:cs="Times New Roman"/>
+        </w:rPr>
+        <w:t>APVV</w:t>
+      </w:r>
+      <w:proofErr w:type="gramEnd"/>
+      <w:r>
+        <w:rPr>
+          <w:rFonts w:ascii="Times New Roman" w:hAnsi="Times New Roman" w:cs="Times New Roman"/>
+        </w:rPr>
+        <w:t>-24-0484 (TEPALIT)</w:t>
       </w:r>
       <w:hyperlink r:id="rId5" w:anchor="fn1" w:history="1">
         <w:r>
@@ -200,49 +154,15 @@
         </w:rPr>
         <w:t> </w:t>
       </w:r>
-      <w:r>
-        <w:rPr>
-          <w:rFonts w:ascii="Times New Roman" w:hAnsi="Times New Roman" w:cs="Times New Roman"/>
-          <w:b/>
-          <w:bCs/>
-        </w:rPr>
-        <w:t>Language:</w:t>
-      </w:r>
-      <w:r>
-        <w:rPr>
-          <w:rFonts w:ascii="Times New Roman" w:hAnsi="Times New Roman" w:cs="Times New Roman"/>
-        </w:rPr>
-        <w:t> British English </w:t>
-      </w:r>
-      <w:r>
-        <w:rPr>
-          <w:rFonts w:ascii="Times New Roman" w:hAnsi="Times New Roman" w:cs="Times New Roman"/>
-          <w:b/>
-          <w:bCs/>
-        </w:rPr>
-        <w:t>Date:</w:t>
-      </w:r>
-      <w:r>
-        <w:rPr>
-          <w:rFonts w:ascii="Times New Roman" w:hAnsi="Times New Roman" w:cs="Times New Roman"/>
-        </w:rPr>
-        <w:t> 2026-05-08</w:t>
-      </w:r>
     </w:p>
     <w:p>
       <w:pPr>
         <w:rPr>
           <w:rFonts w:ascii="Times New Roman" w:hAnsi="Times New Roman" w:cs="Times New Roman"/>
+          <w:b/>
+          <w:bCs/>
         </w:rPr>
       </w:pPr>
-      <w:r>
-        <w:rPr>
-          <w:rFonts w:ascii="Times New Roman" w:hAnsi="Times New Roman" w:cs="Times New Roman"/>
-        </w:rPr>
-        <w:pict w14:anchorId="29F38C98">
-          <v:rect id="_x0000_i1061" style="width:0;height:3pt" o:hralign="center" o:hrstd="t" o:hr="t" fillcolor="#a0a0a0" stroked="f"/>
-        </w:pict>
-      </w:r>
     </w:p>
     <w:p>
       <w:pPr>
@@ -846,7 +766,7 @@
           <w:rFonts w:ascii="Times New Roman" w:hAnsi="Times New Roman" w:cs="Times New Roman"/>
         </w:rPr>
         <w:pict w14:anchorId="7F657915">
-          <v:rect id="_x0000_i1062" style="width:0;height:3pt" o:hralign="center" o:hrstd="t" o:hr="t" fillcolor="#a0a0a0" stroked="f"/>
+          <v:rect id="_x0000_i1026" style="width:0;height:3pt" o:hralign="center" o:hrstd="t" o:hr="t" fillcolor="#a0a0a0" stroked="f"/>
         </w:pict>
       </w:r>
     </w:p>
@@ -1055,29 +975,35 @@
         <w:rPr>
           <w:rFonts w:ascii="Times New Roman" w:hAnsi="Times New Roman" w:cs="Times New Roman"/>
         </w:rPr>
+        <w:t>Sekelská</w:t>
+      </w:r>
+      <w:proofErr w:type="spellEnd"/>
+      <w:r>
+        <w:rPr>
+          <w:rFonts w:ascii="Times New Roman" w:hAnsi="Times New Roman" w:cs="Times New Roman"/>
+        </w:rPr>
+        <w:t xml:space="preserve"> has quantified the older Czech repertoire absorbed into the </w:t>
+      </w:r>
+      <w:r>
+        <w:rPr>
+          <w:rFonts w:ascii="Times New Roman" w:hAnsi="Times New Roman" w:cs="Times New Roman"/>
+          <w:i/>
+          <w:iCs/>
+        </w:rPr>
+        <w:t>Cithara Sanctorum</w:t>
+      </w:r>
+      <w:r>
+        <w:rPr>
+          <w:rFonts w:ascii="Times New Roman" w:hAnsi="Times New Roman" w:cs="Times New Roman"/>
+        </w:rPr>
+        <w:t xml:space="preserve"> and </w:t>
+      </w:r>
+      <w:r>
+        <w:rPr>
+          <w:rFonts w:ascii="Times New Roman" w:hAnsi="Times New Roman" w:cs="Times New Roman"/>
+        </w:rPr>
         <w:lastRenderedPageBreak/>
-        <w:t>Sekelská</w:t>
-      </w:r>
-      <w:proofErr w:type="spellEnd"/>
-      <w:r>
-        <w:rPr>
-          <w:rFonts w:ascii="Times New Roman" w:hAnsi="Times New Roman" w:cs="Times New Roman"/>
-        </w:rPr>
-        <w:t xml:space="preserve"> has quantified the older Czech repertoire absorbed into the </w:t>
-      </w:r>
-      <w:r>
-        <w:rPr>
-          <w:rFonts w:ascii="Times New Roman" w:hAnsi="Times New Roman" w:cs="Times New Roman"/>
-          <w:i/>
-          <w:iCs/>
-        </w:rPr>
-        <w:t>Cithara Sanctorum</w:t>
-      </w:r>
-      <w:r>
-        <w:rPr>
-          <w:rFonts w:ascii="Times New Roman" w:hAnsi="Times New Roman" w:cs="Times New Roman"/>
-        </w:rPr>
-        <w:t xml:space="preserve"> and shown that approximately half of it is </w:t>
+        <w:t xml:space="preserve">shown that approximately half of it is </w:t>
       </w:r>
       <w:proofErr w:type="spellStart"/>
       <w:r>
@@ -2978,7 +2904,7 @@
           <w:rFonts w:ascii="Times New Roman" w:hAnsi="Times New Roman" w:cs="Times New Roman"/>
         </w:rPr>
         <w:pict w14:anchorId="72E320F9">
-          <v:rect id="_x0000_i1063" style="width:0;height:3pt" o:hralign="center" o:hrstd="t" o:hr="t" fillcolor="#a0a0a0" stroked="f"/>
+          <v:rect id="_x0000_i1027" style="width:0;height:3pt" o:hralign="center" o:hrstd="t" o:hr="t" fillcolor="#a0a0a0" stroked="f"/>
         </w:pict>
       </w:r>
     </w:p>
@@ -7573,7 +7499,7 @@
           <w:rFonts w:ascii="Times New Roman" w:hAnsi="Times New Roman" w:cs="Times New Roman"/>
         </w:rPr>
         <w:pict w14:anchorId="0E74E486">
-          <v:rect id="_x0000_i1064" style="width:0;height:3pt" o:hralign="center" o:hrstd="t" o:hr="t" fillcolor="#a0a0a0" stroked="f"/>
+          <v:rect id="_x0000_i1028" style="width:0;height:3pt" o:hralign="center" o:hrstd="t" o:hr="t" fillcolor="#a0a0a0" stroked="f"/>
         </w:pict>
       </w:r>
     </w:p>
@@ -9879,7 +9805,7 @@
           <w:rFonts w:ascii="Times New Roman" w:hAnsi="Times New Roman" w:cs="Times New Roman"/>
         </w:rPr>
         <w:pict w14:anchorId="356FAA18">
-          <v:rect id="_x0000_i1065" style="width:0;height:3pt" o:hralign="center" o:hrstd="t" o:hr="t" fillcolor="#a0a0a0" stroked="f"/>
+          <v:rect id="_x0000_i1029" style="width:0;height:3pt" o:hralign="center" o:hrstd="t" o:hr="t" fillcolor="#a0a0a0" stroked="f"/>
         </w:pict>
       </w:r>
     </w:p>
@@ -9927,7 +9853,7 @@
           <w:rFonts w:ascii="Times New Roman" w:hAnsi="Times New Roman" w:cs="Times New Roman"/>
         </w:rPr>
         <w:pict w14:anchorId="17DD2427">
-          <v:rect id="_x0000_i1066" style="width:0;height:3pt" o:hralign="center" o:hrstd="t" o:hr="t" fillcolor="#a0a0a0" stroked="f"/>
+          <v:rect id="_x0000_i1030" style="width:0;height:3pt" o:hralign="center" o:hrstd="t" o:hr="t" fillcolor="#a0a0a0" stroked="f"/>
         </w:pict>
       </w:r>
     </w:p>
@@ -18328,6 +18254,7 @@
   <w:style w:type="character" w:default="1" w:styleId="DefaultParagraphFont">
     <w:name w:val="Default Paragraph Font"/>
     <w:uiPriority w:val="1"/>
+    <w:semiHidden/>
     <w:unhideWhenUsed/>
   </w:style>
   <w:style w:type="table" w:default="1" w:styleId="TableNormal">

</xml_diff>